<commit_message>
atualização da aula 05/10/26
</commit_message>
<xml_diff>
--- a/apostila/Projeto Space for me3 (Recuperação Automática).docx
+++ b/apostila/Projeto Space for me3 (Recuperação Automática).docx
@@ -14142,6 +14142,7 @@
       <w:r>
         <w:rPr>
           <w:i/>
+          <w:noProof/>
         </w:rPr>
         <w:drawing>
           <wp:inline distT="0" distB="0" distL="0" distR="0" wp14:anchorId="6558BECC" wp14:editId="0F929436">
@@ -14301,6 +14302,7 @@
       <w:r>
         <w:rPr>
           <w:i/>
+          <w:noProof/>
         </w:rPr>
         <w:drawing>
           <wp:inline distT="0" distB="0" distL="0" distR="0" wp14:anchorId="6DFDAA57" wp14:editId="377CB16F">
@@ -14341,6 +14343,7 @@
       <w:r>
         <w:rPr>
           <w:i/>
+          <w:noProof/>
         </w:rPr>
         <w:drawing>
           <wp:inline distT="0" distB="0" distL="0" distR="0" wp14:anchorId="4F7A84A4" wp14:editId="2A3F682A">
@@ -14410,7 +14413,21 @@
         <w:rPr>
           <w:i/>
         </w:rPr>
-        <w:t xml:space="preserve">: top, incluímos mais dois itens a lista no </w:t>
+        <w:t xml:space="preserve">: top, incluímos mais dois itens </w:t>
+      </w:r>
+      <w:proofErr w:type="spellStart"/>
+      <w:r>
+        <w:rPr>
+          <w:i/>
+        </w:rPr>
+        <w:t>a</w:t>
+      </w:r>
+      <w:proofErr w:type="spellEnd"/>
+      <w:r>
+        <w:rPr>
+          <w:i/>
+        </w:rPr>
+        <w:t xml:space="preserve"> lista no </w:t>
       </w:r>
       <w:proofErr w:type="spellStart"/>
       <w:r>
@@ -14575,6 +14592,7 @@
       <w:r>
         <w:rPr>
           <w:i/>
+          <w:noProof/>
         </w:rPr>
         <w:drawing>
           <wp:inline distT="0" distB="0" distL="0" distR="0" wp14:anchorId="0052F05D" wp14:editId="08DBD7C3">
@@ -14615,6 +14633,7 @@
       <w:r>
         <w:rPr>
           <w:i/>
+          <w:noProof/>
         </w:rPr>
         <w:drawing>
           <wp:inline distT="0" distB="0" distL="0" distR="0" wp14:anchorId="1F523D63" wp14:editId="518EA879">
@@ -14697,6 +14716,7 @@
       <w:r>
         <w:rPr>
           <w:i/>
+          <w:noProof/>
         </w:rPr>
         <w:drawing>
           <wp:inline distT="0" distB="0" distL="0" distR="0" wp14:anchorId="19F90FE7" wp14:editId="17C78A82">
@@ -14737,6 +14757,7 @@
       <w:r>
         <w:rPr>
           <w:i/>
+          <w:noProof/>
         </w:rPr>
         <w:drawing>
           <wp:inline distT="0" distB="0" distL="0" distR="0" wp14:anchorId="6AEF28FC" wp14:editId="569791DE">
@@ -14849,6 +14870,7 @@
       <w:r>
         <w:rPr>
           <w:i/>
+          <w:noProof/>
         </w:rPr>
         <w:drawing>
           <wp:inline distT="0" distB="0" distL="0" distR="0" wp14:anchorId="50F6D766" wp14:editId="28B24264">
@@ -14889,6 +14911,7 @@
       <w:r>
         <w:rPr>
           <w:i/>
+          <w:noProof/>
         </w:rPr>
         <w:drawing>
           <wp:inline distT="0" distB="0" distL="0" distR="0" wp14:anchorId="5FBFC550" wp14:editId="0B951290">
@@ -14949,6 +14972,7 @@
       <w:r>
         <w:rPr>
           <w:i/>
+          <w:noProof/>
         </w:rPr>
         <w:drawing>
           <wp:inline distT="0" distB="0" distL="0" distR="0" wp14:anchorId="0C797511" wp14:editId="2A8CBF4E">
@@ -15011,7 +15035,21 @@
         <w:rPr>
           <w:i/>
         </w:rPr>
-        <w:t xml:space="preserve"> que contem a lista e a imagem benefícios demos uma largura e centralizamos o </w:t>
+        <w:t xml:space="preserve"> que </w:t>
+      </w:r>
+      <w:proofErr w:type="spellStart"/>
+      <w:r>
+        <w:rPr>
+          <w:i/>
+        </w:rPr>
+        <w:t>contem</w:t>
+      </w:r>
+      <w:proofErr w:type="spellEnd"/>
+      <w:r>
+        <w:rPr>
+          <w:i/>
+        </w:rPr>
+        <w:t xml:space="preserve"> a lista e a imagem benefícios demos uma largura e centralizamos o </w:t>
       </w:r>
       <w:proofErr w:type="gramStart"/>
       <w:r>
@@ -15037,6 +15075,7 @@
       <w:r>
         <w:rPr>
           <w:i/>
+          <w:noProof/>
         </w:rPr>
         <w:drawing>
           <wp:inline distT="0" distB="0" distL="0" distR="0" wp14:anchorId="69B2166F" wp14:editId="70139057">
@@ -15074,8 +15113,698 @@
           </wp:inline>
         </w:drawing>
       </w:r>
+    </w:p>
+    <w:p>
+      <w:pPr>
+        <w:rPr>
+          <w:i/>
+        </w:rPr>
+      </w:pPr>
+      <w:r>
+        <w:rPr>
+          <w:i/>
+        </w:rPr>
+        <w:t xml:space="preserve">110-Aumentamos o espaço interno da </w:t>
+      </w:r>
+      <w:proofErr w:type="spellStart"/>
+      <w:r>
+        <w:rPr>
+          <w:i/>
+        </w:rPr>
+        <w:t>section</w:t>
+      </w:r>
+      <w:proofErr w:type="spellEnd"/>
+      <w:r>
+        <w:rPr>
+          <w:i/>
+        </w:rPr>
+        <w:t xml:space="preserve"> principal e adicionamos uma cor de fundo para fazer um degrade ou seja é área onde duas ou mais cores são sobrepostas.</w:t>
+      </w:r>
+    </w:p>
+    <w:p>
+      <w:pPr>
+        <w:rPr>
+          <w:i/>
+        </w:rPr>
+      </w:pPr>
+      <w:r>
+        <w:rPr>
+          <w:i/>
+        </w:rPr>
+        <w:drawing>
+          <wp:inline distT="0" distB="0" distL="0" distR="0" wp14:anchorId="5820E5C6" wp14:editId="011BB426">
+            <wp:extent cx="1562318" cy="562053"/>
+            <wp:effectExtent l="0" t="0" r="0" b="9525"/>
+            <wp:docPr id="209" name="Imagem 209"/>
+            <wp:cNvGraphicFramePr>
+              <a:graphicFrameLocks xmlns:a="http://schemas.openxmlformats.org/drawingml/2006/main" noChangeAspect="1"/>
+            </wp:cNvGraphicFramePr>
+            <a:graphic xmlns:a="http://schemas.openxmlformats.org/drawingml/2006/main">
+              <a:graphicData uri="http://schemas.openxmlformats.org/drawingml/2006/picture">
+                <pic:pic xmlns:pic="http://schemas.openxmlformats.org/drawingml/2006/picture">
+                  <pic:nvPicPr>
+                    <pic:cNvPr id="1" name=""/>
+                    <pic:cNvPicPr/>
+                  </pic:nvPicPr>
+                  <pic:blipFill>
+                    <a:blip r:embed="rId180"/>
+                    <a:stretch>
+                      <a:fillRect/>
+                    </a:stretch>
+                  </pic:blipFill>
+                  <pic:spPr>
+                    <a:xfrm>
+                      <a:off x="0" y="0"/>
+                      <a:ext cx="1562318" cy="562053"/>
+                    </a:xfrm>
+                    <a:prstGeom prst="rect">
+                      <a:avLst/>
+                    </a:prstGeom>
+                  </pic:spPr>
+                </pic:pic>
+              </a:graphicData>
+            </a:graphic>
+          </wp:inline>
+        </w:drawing>
+      </w:r>
+    </w:p>
+    <w:p>
+      <w:pPr>
+        <w:rPr>
+          <w:i/>
+        </w:rPr>
+      </w:pPr>
+      <w:r>
+        <w:rPr>
+          <w:i/>
+        </w:rPr>
+        <w:t xml:space="preserve">111-Colocamos uma cor de fundo na </w:t>
+      </w:r>
+      <w:proofErr w:type="spellStart"/>
+      <w:r>
+        <w:rPr>
+          <w:i/>
+        </w:rPr>
+        <w:t>section</w:t>
+      </w:r>
+      <w:proofErr w:type="spellEnd"/>
+      <w:r>
+        <w:rPr>
+          <w:i/>
+        </w:rPr>
+        <w:t xml:space="preserve"> “benefícios” para realizar o nosso degrade.</w:t>
+      </w:r>
+    </w:p>
+    <w:p>
+      <w:pPr>
+        <w:rPr>
+          <w:i/>
+        </w:rPr>
+      </w:pPr>
+      <w:r>
+        <w:rPr>
+          <w:i/>
+        </w:rPr>
+        <w:drawing>
+          <wp:inline distT="0" distB="0" distL="0" distR="0" wp14:anchorId="3671FE32" wp14:editId="4E318700">
+            <wp:extent cx="2295845" cy="743054"/>
+            <wp:effectExtent l="0" t="0" r="0" b="0"/>
+            <wp:docPr id="212" name="Imagem 212"/>
+            <wp:cNvGraphicFramePr>
+              <a:graphicFrameLocks xmlns:a="http://schemas.openxmlformats.org/drawingml/2006/main" noChangeAspect="1"/>
+            </wp:cNvGraphicFramePr>
+            <a:graphic xmlns:a="http://schemas.openxmlformats.org/drawingml/2006/main">
+              <a:graphicData uri="http://schemas.openxmlformats.org/drawingml/2006/picture">
+                <pic:pic xmlns:pic="http://schemas.openxmlformats.org/drawingml/2006/picture">
+                  <pic:nvPicPr>
+                    <pic:cNvPr id="1" name=""/>
+                    <pic:cNvPicPr/>
+                  </pic:nvPicPr>
+                  <pic:blipFill>
+                    <a:blip r:embed="rId181"/>
+                    <a:stretch>
+                      <a:fillRect/>
+                    </a:stretch>
+                  </pic:blipFill>
+                  <pic:spPr>
+                    <a:xfrm>
+                      <a:off x="0" y="0"/>
+                      <a:ext cx="2295845" cy="743054"/>
+                    </a:xfrm>
+                    <a:prstGeom prst="rect">
+                      <a:avLst/>
+                    </a:prstGeom>
+                  </pic:spPr>
+                </pic:pic>
+              </a:graphicData>
+            </a:graphic>
+          </wp:inline>
+        </w:drawing>
+      </w:r>
+    </w:p>
+    <w:p>
+      <w:pPr>
+        <w:rPr>
+          <w:i/>
+        </w:rPr>
+      </w:pPr>
+      <w:r>
+        <w:rPr>
+          <w:i/>
+        </w:rPr>
+        <w:t>112</w:t>
+      </w:r>
+      <w:r>
+        <w:rPr>
+          <w:i/>
+        </w:rPr>
+        <w:t xml:space="preserve">-Para fazer o degrade tiramos o </w:t>
+      </w:r>
+      <w:proofErr w:type="spellStart"/>
+      <w:r>
+        <w:rPr>
+          <w:i/>
+        </w:rPr>
+        <w:t>main</w:t>
+      </w:r>
+      <w:proofErr w:type="spellEnd"/>
+      <w:r>
+        <w:rPr>
+          <w:i/>
+        </w:rPr>
+        <w:t xml:space="preserve"> que estava configurando para a largura de 940px e centralizando o elemento em margin:0 </w:t>
+      </w:r>
+    </w:p>
+    <w:p>
+      <w:pPr>
+        <w:rPr>
+          <w:i/>
+        </w:rPr>
+      </w:pPr>
+      <w:r>
+        <w:rPr>
+          <w:i/>
+        </w:rPr>
+        <w:drawing>
+          <wp:inline distT="0" distB="0" distL="0" distR="0" wp14:anchorId="375618EB" wp14:editId="7D06B726">
+            <wp:extent cx="2390775" cy="1066800"/>
+            <wp:effectExtent l="0" t="0" r="9525" b="0"/>
+            <wp:docPr id="218" name="Imagem 218"/>
+            <wp:cNvGraphicFramePr>
+              <a:graphicFrameLocks xmlns:a="http://schemas.openxmlformats.org/drawingml/2006/main" noChangeAspect="1"/>
+            </wp:cNvGraphicFramePr>
+            <a:graphic xmlns:a="http://schemas.openxmlformats.org/drawingml/2006/main">
+              <a:graphicData uri="http://schemas.openxmlformats.org/drawingml/2006/picture">
+                <pic:pic xmlns:pic="http://schemas.openxmlformats.org/drawingml/2006/picture">
+                  <pic:nvPicPr>
+                    <pic:cNvPr id="1" name=""/>
+                    <pic:cNvPicPr/>
+                  </pic:nvPicPr>
+                  <pic:blipFill>
+                    <a:blip r:embed="rId182"/>
+                    <a:stretch>
+                      <a:fillRect/>
+                    </a:stretch>
+                  </pic:blipFill>
+                  <pic:spPr>
+                    <a:xfrm>
+                      <a:off x="0" y="0"/>
+                      <a:ext cx="2391110" cy="1066949"/>
+                    </a:xfrm>
+                    <a:prstGeom prst="rect">
+                      <a:avLst/>
+                    </a:prstGeom>
+                  </pic:spPr>
+                </pic:pic>
+              </a:graphicData>
+            </a:graphic>
+          </wp:inline>
+        </w:drawing>
+      </w:r>
+    </w:p>
+    <w:p>
+      <w:pPr>
+        <w:rPr>
+          <w:i/>
+        </w:rPr>
+      </w:pPr>
+      <w:r>
+        <w:rPr>
+          <w:i/>
+        </w:rPr>
+        <w:t xml:space="preserve">auto, ao colocar a cor de fundo nas </w:t>
+      </w:r>
+      <w:proofErr w:type="spellStart"/>
+      <w:r>
+        <w:rPr>
+          <w:i/>
+        </w:rPr>
+        <w:t>section</w:t>
+      </w:r>
+      <w:proofErr w:type="spellEnd"/>
+      <w:r>
+        <w:rPr>
+          <w:i/>
+        </w:rPr>
+        <w:t xml:space="preserve"> que estava dentro do </w:t>
+      </w:r>
+      <w:proofErr w:type="spellStart"/>
+      <w:r>
+        <w:rPr>
+          <w:i/>
+        </w:rPr>
+        <w:t>main</w:t>
+      </w:r>
+      <w:proofErr w:type="spellEnd"/>
+      <w:r>
+        <w:rPr>
+          <w:i/>
+        </w:rPr>
+        <w:t xml:space="preserve"> as cores ficavam </w:t>
+      </w:r>
+      <w:proofErr w:type="gramStart"/>
+      <w:r>
+        <w:rPr>
+          <w:i/>
+        </w:rPr>
+        <w:t>centralizados .</w:t>
+      </w:r>
+      <w:proofErr w:type="gramEnd"/>
+      <w:r>
+        <w:rPr>
+          <w:i/>
+        </w:rPr>
+        <w:t xml:space="preserve"> Para resolver colocamos o </w:t>
+      </w:r>
+      <w:proofErr w:type="spellStart"/>
+      <w:r>
+        <w:rPr>
+          <w:i/>
+        </w:rPr>
+        <w:t>margin</w:t>
+      </w:r>
+      <w:proofErr w:type="spellEnd"/>
+      <w:r>
+        <w:rPr>
+          <w:i/>
+        </w:rPr>
+        <w:t xml:space="preserve"> 0 auto e </w:t>
+      </w:r>
+      <w:proofErr w:type="spellStart"/>
+      <w:r>
+        <w:rPr>
+          <w:i/>
+        </w:rPr>
+        <w:t>width</w:t>
+      </w:r>
+      <w:proofErr w:type="spellEnd"/>
+      <w:r>
+        <w:rPr>
+          <w:i/>
+        </w:rPr>
+        <w:t xml:space="preserve"> 940px na </w:t>
+      </w:r>
+      <w:proofErr w:type="spellStart"/>
+      <w:r>
+        <w:rPr>
+          <w:i/>
+        </w:rPr>
+        <w:t>section</w:t>
+      </w:r>
+      <w:proofErr w:type="spellEnd"/>
+      <w:r>
+        <w:rPr>
+          <w:i/>
+        </w:rPr>
+        <w:t xml:space="preserve"> principal e </w:t>
+      </w:r>
+      <w:proofErr w:type="spellStart"/>
+      <w:r>
+        <w:rPr>
+          <w:i/>
+        </w:rPr>
+        <w:t>section</w:t>
+      </w:r>
+      <w:proofErr w:type="spellEnd"/>
+      <w:r>
+        <w:rPr>
+          <w:i/>
+        </w:rPr>
+        <w:t xml:space="preserve"> mapa e na </w:t>
+      </w:r>
+      <w:proofErr w:type="spellStart"/>
+      <w:r>
+        <w:rPr>
+          <w:i/>
+        </w:rPr>
+        <w:t>section</w:t>
+      </w:r>
+      <w:proofErr w:type="spellEnd"/>
+      <w:r>
+        <w:rPr>
+          <w:i/>
+        </w:rPr>
+        <w:t xml:space="preserve"> benefícios. </w:t>
+      </w:r>
+    </w:p>
+    <w:p>
+      <w:pPr>
+        <w:rPr>
+          <w:i/>
+        </w:rPr>
+      </w:pPr>
+      <w:r>
+        <w:rPr>
+          <w:i/>
+        </w:rPr>
+        <w:drawing>
+          <wp:inline distT="0" distB="0" distL="0" distR="0" wp14:anchorId="486B19B2" wp14:editId="4FC58A7E">
+            <wp:extent cx="3981450" cy="1066800"/>
+            <wp:effectExtent l="0" t="0" r="0" b="0"/>
+            <wp:docPr id="219" name="Imagem 219"/>
+            <wp:cNvGraphicFramePr>
+              <a:graphicFrameLocks xmlns:a="http://schemas.openxmlformats.org/drawingml/2006/main" noChangeAspect="1"/>
+            </wp:cNvGraphicFramePr>
+            <a:graphic xmlns:a="http://schemas.openxmlformats.org/drawingml/2006/main">
+              <a:graphicData uri="http://schemas.openxmlformats.org/drawingml/2006/picture">
+                <pic:pic xmlns:pic="http://schemas.openxmlformats.org/drawingml/2006/picture">
+                  <pic:nvPicPr>
+                    <pic:cNvPr id="1" name=""/>
+                    <pic:cNvPicPr/>
+                  </pic:nvPicPr>
+                  <pic:blipFill>
+                    <a:blip r:embed="rId183"/>
+                    <a:stretch>
+                      <a:fillRect/>
+                    </a:stretch>
+                  </pic:blipFill>
+                  <pic:spPr>
+                    <a:xfrm>
+                      <a:off x="0" y="0"/>
+                      <a:ext cx="3982010" cy="1066950"/>
+                    </a:xfrm>
+                    <a:prstGeom prst="rect">
+                      <a:avLst/>
+                    </a:prstGeom>
+                  </pic:spPr>
+                </pic:pic>
+              </a:graphicData>
+            </a:graphic>
+          </wp:inline>
+        </w:drawing>
+      </w:r>
+    </w:p>
+    <w:p>
+      <w:pPr>
+        <w:rPr>
+          <w:i/>
+        </w:rPr>
+      </w:pPr>
+      <w:r>
+        <w:rPr>
+          <w:i/>
+        </w:rPr>
+        <w:t xml:space="preserve">113-Durante os ajustes, percebemos que o mapa também não estava centralizado corretamente. </w:t>
+      </w:r>
+    </w:p>
+    <w:p>
+      <w:pPr>
+        <w:rPr>
+          <w:i/>
+        </w:rPr>
+      </w:pPr>
+      <w:r>
+        <w:rPr>
+          <w:i/>
+        </w:rPr>
+        <w:t xml:space="preserve">Para solucionar esse problema, criamos uma </w:t>
+      </w:r>
+      <w:proofErr w:type="spellStart"/>
+      <w:r>
+        <w:rPr>
+          <w:i/>
+        </w:rPr>
+        <w:t>div</w:t>
+      </w:r>
+      <w:proofErr w:type="spellEnd"/>
+      <w:r>
+        <w:rPr>
+          <w:i/>
+        </w:rPr>
+        <w:t xml:space="preserve"> </w:t>
+      </w:r>
+      <w:proofErr w:type="gramStart"/>
+      <w:r>
+        <w:rPr>
+          <w:i/>
+        </w:rPr>
+        <w:t>chamada .mapa</w:t>
+      </w:r>
+      <w:proofErr w:type="gramEnd"/>
+      <w:r>
+        <w:rPr>
+          <w:i/>
+        </w:rPr>
+        <w:t>-</w:t>
+      </w:r>
+      <w:proofErr w:type="spellStart"/>
+      <w:r>
+        <w:rPr>
+          <w:i/>
+        </w:rPr>
+        <w:t>conteudo</w:t>
+      </w:r>
+      <w:proofErr w:type="spellEnd"/>
+      <w:r>
+        <w:rPr>
+          <w:i/>
+        </w:rPr>
+        <w:t>.</w:t>
+      </w:r>
+    </w:p>
+    <w:p>
+      <w:pPr>
+        <w:rPr>
+          <w:i/>
+        </w:rPr>
+      </w:pPr>
+      <w:proofErr w:type="spellStart"/>
+      <w:r>
+        <w:rPr>
+          <w:i/>
+        </w:rPr>
+        <w:t>Responsavel</w:t>
+      </w:r>
+      <w:proofErr w:type="spellEnd"/>
+      <w:r>
+        <w:rPr>
+          <w:i/>
+        </w:rPr>
+        <w:t xml:space="preserve"> por envolver o mapa:</w:t>
+      </w:r>
+    </w:p>
+    <w:p>
+      <w:pPr>
+        <w:rPr>
+          <w:i/>
+        </w:rPr>
+      </w:pPr>
+      <w:r>
+        <w:rPr>
+          <w:i/>
+        </w:rPr>
+        <w:drawing>
+          <wp:inline distT="0" distB="0" distL="0" distR="0" wp14:anchorId="0863452F" wp14:editId="3D4C5F1E">
+            <wp:extent cx="4972050" cy="1066800"/>
+            <wp:effectExtent l="0" t="0" r="0" b="0"/>
+            <wp:docPr id="222" name="Imagem 222"/>
+            <wp:cNvGraphicFramePr>
+              <a:graphicFrameLocks xmlns:a="http://schemas.openxmlformats.org/drawingml/2006/main" noChangeAspect="1"/>
+            </wp:cNvGraphicFramePr>
+            <a:graphic xmlns:a="http://schemas.openxmlformats.org/drawingml/2006/main">
+              <a:graphicData uri="http://schemas.openxmlformats.org/drawingml/2006/picture">
+                <pic:pic xmlns:pic="http://schemas.openxmlformats.org/drawingml/2006/picture">
+                  <pic:nvPicPr>
+                    <pic:cNvPr id="1" name=""/>
+                    <pic:cNvPicPr/>
+                  </pic:nvPicPr>
+                  <pic:blipFill>
+                    <a:blip r:embed="rId184"/>
+                    <a:stretch>
+                      <a:fillRect/>
+                    </a:stretch>
+                  </pic:blipFill>
+                  <pic:spPr>
+                    <a:xfrm>
+                      <a:off x="0" y="0"/>
+                      <a:ext cx="4972786" cy="1066958"/>
+                    </a:xfrm>
+                    <a:prstGeom prst="rect">
+                      <a:avLst/>
+                    </a:prstGeom>
+                  </pic:spPr>
+                </pic:pic>
+              </a:graphicData>
+            </a:graphic>
+          </wp:inline>
+        </w:drawing>
+      </w:r>
+      <w:r>
+        <w:rPr>
+          <w:i/>
+        </w:rPr>
+        <w:drawing>
+          <wp:inline distT="0" distB="0" distL="0" distR="0" wp14:anchorId="57158703" wp14:editId="6FE95049">
+            <wp:extent cx="2781688" cy="762106"/>
+            <wp:effectExtent l="0" t="0" r="0" b="0"/>
+            <wp:docPr id="223" name="Imagem 223"/>
+            <wp:cNvGraphicFramePr>
+              <a:graphicFrameLocks xmlns:a="http://schemas.openxmlformats.org/drawingml/2006/main" noChangeAspect="1"/>
+            </wp:cNvGraphicFramePr>
+            <a:graphic xmlns:a="http://schemas.openxmlformats.org/drawingml/2006/main">
+              <a:graphicData uri="http://schemas.openxmlformats.org/drawingml/2006/picture">
+                <pic:pic xmlns:pic="http://schemas.openxmlformats.org/drawingml/2006/picture">
+                  <pic:nvPicPr>
+                    <pic:cNvPr id="1" name=""/>
+                    <pic:cNvPicPr/>
+                  </pic:nvPicPr>
+                  <pic:blipFill>
+                    <a:blip r:embed="rId185"/>
+                    <a:stretch>
+                      <a:fillRect/>
+                    </a:stretch>
+                  </pic:blipFill>
+                  <pic:spPr>
+                    <a:xfrm>
+                      <a:off x="0" y="0"/>
+                      <a:ext cx="2781688" cy="762106"/>
+                    </a:xfrm>
+                    <a:prstGeom prst="rect">
+                      <a:avLst/>
+                    </a:prstGeom>
+                  </pic:spPr>
+                </pic:pic>
+              </a:graphicData>
+            </a:graphic>
+          </wp:inline>
+        </w:drawing>
+      </w:r>
+    </w:p>
+    <w:p>
+      <w:pPr>
+        <w:rPr>
+          <w:i/>
+        </w:rPr>
+      </w:pPr>
+      <w:r>
+        <w:rPr>
+          <w:i/>
+        </w:rPr>
+        <w:t>114-</w:t>
+      </w:r>
+      <w:r>
+        <w:rPr>
+          <w:i/>
+        </w:rPr>
+        <w:t xml:space="preserve">Dessa forma, o fundo da </w:t>
+      </w:r>
+      <w:proofErr w:type="gramStart"/>
+      <w:r>
+        <w:rPr>
+          <w:i/>
+        </w:rPr>
+        <w:t>seção .mapa</w:t>
+      </w:r>
+      <w:proofErr w:type="gramEnd"/>
+      <w:r>
+        <w:rPr>
+          <w:i/>
+        </w:rPr>
+        <w:t xml:space="preserve"> pode ocupar toda a área disponível, enquanto o conteúdo do mapa permanece centralizado em uma largura de 940px.</w:t>
+      </w:r>
+    </w:p>
+    <w:p>
+      <w:pPr>
+        <w:rPr>
+          <w:i/>
+        </w:rPr>
+      </w:pPr>
+      <w:r>
+        <w:rPr>
+          <w:i/>
+        </w:rPr>
+        <w:drawing>
+          <wp:inline distT="0" distB="0" distL="0" distR="0" wp14:anchorId="035C040A" wp14:editId="7C139ECA">
+            <wp:extent cx="4239217" cy="933580"/>
+            <wp:effectExtent l="0" t="0" r="9525" b="0"/>
+            <wp:docPr id="224" name="Imagem 224"/>
+            <wp:cNvGraphicFramePr>
+              <a:graphicFrameLocks xmlns:a="http://schemas.openxmlformats.org/drawingml/2006/main" noChangeAspect="1"/>
+            </wp:cNvGraphicFramePr>
+            <a:graphic xmlns:a="http://schemas.openxmlformats.org/drawingml/2006/main">
+              <a:graphicData uri="http://schemas.openxmlformats.org/drawingml/2006/picture">
+                <pic:pic xmlns:pic="http://schemas.openxmlformats.org/drawingml/2006/picture">
+                  <pic:nvPicPr>
+                    <pic:cNvPr id="1" name=""/>
+                    <pic:cNvPicPr/>
+                  </pic:nvPicPr>
+                  <pic:blipFill>
+                    <a:blip r:embed="rId186"/>
+                    <a:stretch>
+                      <a:fillRect/>
+                    </a:stretch>
+                  </pic:blipFill>
+                  <pic:spPr>
+                    <a:xfrm>
+                      <a:off x="0" y="0"/>
+                      <a:ext cx="4239217" cy="933580"/>
+                    </a:xfrm>
+                    <a:prstGeom prst="rect">
+                      <a:avLst/>
+                    </a:prstGeom>
+                  </pic:spPr>
+                </pic:pic>
+              </a:graphicData>
+            </a:graphic>
+          </wp:inline>
+        </w:drawing>
+      </w:r>
+    </w:p>
+    <w:p>
+      <w:pPr>
+        <w:rPr>
+          <w:i/>
+        </w:rPr>
+      </w:pPr>
+      <w:r>
+        <w:rPr>
+          <w:i/>
+        </w:rPr>
+        <w:t xml:space="preserve">O objetivo é criar uma transição suave entre as cores das seções. Como o mapa está localizado entre a seção principal e a seção de benefícios, o </w:t>
+      </w:r>
+      <w:proofErr w:type="spellStart"/>
+      <w:r>
+        <w:rPr>
+          <w:i/>
+        </w:rPr>
+        <w:t>degradê</w:t>
+      </w:r>
+      <w:proofErr w:type="spellEnd"/>
+      <w:r>
+        <w:rPr>
+          <w:i/>
+        </w:rPr>
+        <w:t xml:space="preserve"> cria uma transição visual entre esses diferentes fundos.</w:t>
+      </w:r>
       <w:bookmarkStart w:id="0" w:name="_GoBack"/>
       <w:bookmarkEnd w:id="0"/>
+    </w:p>
+    <w:p>
+      <w:pPr>
+        <w:rPr>
+          <w:i/>
+        </w:rPr>
+      </w:pPr>
     </w:p>
     <w:sectPr>
       <w:pgSz w:w="11906" w:h="16838"/>
@@ -16241,15 +16970,6 @@
 </file>
 
 <file path=customXml/item1.xml><?xml version="1.0" encoding="utf-8"?>
-<?mso-contentType ?>
-<FormTemplates xmlns="http://schemas.microsoft.com/sharepoint/v3/contenttype/forms">
-  <Display>DocumentLibraryForm</Display>
-  <Edit>DocumentLibraryForm</Edit>
-  <New>DocumentLibraryForm</New>
-</FormTemplates>
-</file>
-
-<file path=customXml/item2.xml><?xml version="1.0" encoding="utf-8"?>
 <ct:contentTypeSchema xmlns:ct="http://schemas.microsoft.com/office/2006/metadata/contentType" xmlns:ma="http://schemas.microsoft.com/office/2006/metadata/properties/metaAttributes" ct:_="" ma:_="" ma:contentTypeName="Documento" ma:contentTypeID="0x01010034B17ED9C83E394791ACA33DA9287452" ma:contentTypeVersion="16" ma:contentTypeDescription="Crie um novo documento." ma:contentTypeScope="" ma:versionID="d36ce64b1b29120840e9f9b956471cbb">
   <xsd:schema xmlns:xsd="http://www.w3.org/2001/XMLSchema" xmlns:xs="http://www.w3.org/2001/XMLSchema" xmlns:p="http://schemas.microsoft.com/office/2006/metadata/properties" xmlns:ns3="8437a765-f0a9-40aa-978b-fcc06261281f" xmlns:ns4="e78d8b06-d887-4705-9cec-751f2fb2cee2" targetNamespace="http://schemas.microsoft.com/office/2006/metadata/properties" ma:root="true" ma:fieldsID="ab1d645bb15f72c0dfc8a8f602f1de6b" ns3:_="" ns4:_="">
     <xsd:import namespace="8437a765-f0a9-40aa-978b-fcc06261281f"/>
@@ -16488,7 +17208,7 @@
 </ct:contentTypeSchema>
 </file>
 
-<file path=customXml/item3.xml><?xml version="1.0" encoding="utf-8"?>
+<file path=customXml/item2.xml><?xml version="1.0" encoding="utf-8"?>
 <p:properties xmlns:p="http://schemas.microsoft.com/office/2006/metadata/properties" xmlns:xsi="http://www.w3.org/2001/XMLSchema-instance" xmlns:pc="http://schemas.microsoft.com/office/infopath/2007/PartnerControls">
   <documentManagement>
     <_activity xmlns="8437a765-f0a9-40aa-978b-fcc06261281f" xsi:nil="true"/>
@@ -16496,19 +17216,20 @@
 </p:properties>
 </file>
 
+<file path=customXml/item3.xml><?xml version="1.0" encoding="utf-8"?>
+<?mso-contentType ?>
+<FormTemplates xmlns="http://schemas.microsoft.com/sharepoint/v3/contenttype/forms">
+  <Display>DocumentLibraryForm</Display>
+  <Edit>DocumentLibraryForm</Edit>
+  <New>DocumentLibraryForm</New>
+</FormTemplates>
+</file>
+
 <file path=customXml/item4.xml><?xml version="1.0" encoding="utf-8"?>
 <b:Sources xmlns:b="http://schemas.openxmlformats.org/officeDocument/2006/bibliography" xmlns="http://schemas.openxmlformats.org/officeDocument/2006/bibliography" SelectedStyle="\APASixthEditionOfficeOnline.xsl" StyleName="APA" Version="6"/>
 </file>
 
 <file path=customXml/itemProps1.xml><?xml version="1.0" encoding="utf-8"?>
-<ds:datastoreItem xmlns:ds="http://schemas.openxmlformats.org/officeDocument/2006/customXml" ds:itemID="{38630907-5F1E-4561-A45F-AC7CC415CD73}">
-  <ds:schemaRefs>
-    <ds:schemaRef ds:uri="http://schemas.microsoft.com/sharepoint/v3/contenttype/forms"/>
-  </ds:schemaRefs>
-</ds:datastoreItem>
-</file>
-
-<file path=customXml/itemProps2.xml><?xml version="1.0" encoding="utf-8"?>
 <ds:datastoreItem xmlns:ds="http://schemas.openxmlformats.org/officeDocument/2006/customXml" ds:itemID="{5D63F5B6-DF50-4CAF-997C-1D8B1776178E}">
   <ds:schemaRefs>
     <ds:schemaRef ds:uri="http://schemas.microsoft.com/office/2006/metadata/contentType"/>
@@ -16527,7 +17248,7 @@
 </ds:datastoreItem>
 </file>
 
-<file path=customXml/itemProps3.xml><?xml version="1.0" encoding="utf-8"?>
+<file path=customXml/itemProps2.xml><?xml version="1.0" encoding="utf-8"?>
 <ds:datastoreItem xmlns:ds="http://schemas.openxmlformats.org/officeDocument/2006/customXml" ds:itemID="{0C9FFCBC-F2CA-4FF1-AAFC-AD3B89BB1967}">
   <ds:schemaRefs>
     <ds:schemaRef ds:uri="http://schemas.microsoft.com/office/2006/metadata/properties"/>
@@ -16537,8 +17258,16 @@
 </ds:datastoreItem>
 </file>
 
+<file path=customXml/itemProps3.xml><?xml version="1.0" encoding="utf-8"?>
+<ds:datastoreItem xmlns:ds="http://schemas.openxmlformats.org/officeDocument/2006/customXml" ds:itemID="{38630907-5F1E-4561-A45F-AC7CC415CD73}">
+  <ds:schemaRefs>
+    <ds:schemaRef ds:uri="http://schemas.microsoft.com/sharepoint/v3/contenttype/forms"/>
+  </ds:schemaRefs>
+</ds:datastoreItem>
+</file>
+
 <file path=customXml/itemProps4.xml><?xml version="1.0" encoding="utf-8"?>
-<ds:datastoreItem xmlns:ds="http://schemas.openxmlformats.org/officeDocument/2006/customXml" ds:itemID="{87D6F5E2-D6EC-44E0-82E3-5F7D56E011A6}">
+<ds:datastoreItem xmlns:ds="http://schemas.openxmlformats.org/officeDocument/2006/customXml" ds:itemID="{6BF1F7C2-7DED-4769-A095-A94844052674}">
   <ds:schemaRefs>
     <ds:schemaRef ds:uri="http://schemas.openxmlformats.org/officeDocument/2006/bibliography"/>
   </ds:schemaRefs>

</xml_diff>